<commit_message>
feat: plugin 1.3.6 — báo cáo tháng cấp Trường dựng từ bản đã ban hành (bc_thang.py, bao-cao 3.18)
Khắc phục chạy thử 28/9 (Cowork, Code) kém bản 21/9: mẫu trắng + fill_bc736, thẻ [CẦN BỔ SUNG [PHAN_I]],
lỗi của mẫu, thay tường thuật bằng %, loại cả đơn vị vì lỗi công thức, thiếu kế hoạch tháng sau.
- bc_thang.py: nguon (bản đã ban hành, CTCT, KH quý, giao ban), trich (IIa/IIb/Ib), word/phu-luc/ke-hoach
  từ bản đã ban hành, tự kiểm. Dựng lại nội dung 21/9: trùng 100%. test_bc_thang.py 28 ca.
- Skill 37 + SKILL.md quy trình chính 4 sản phẩm; QĐ-08; fill_bc736 chỉ dự phòng.
- Đóng vào plugin: bc_thang, vanphong, trich_tuong_thuat, ktc_trackchanges. Mẫu trắng sửa 3 lỗi.
- Agent kiểm hồ sơ: trả lại đơn vị không loại khỏi báo cáo. SHA-256 1438c624…a64b; hồi quy 23/23.

Co-Authored-By: Claude Opus 5.5 <noreply@anthropic.com>
</commit_message>
<xml_diff>
--- a/25-KTC-Bao-Cao/00. Mau bao cao thang (cap Truong).docx
+++ b/25-KTC-Bao-Cao/00. Mau bao cao thang (cap Truong).docx
@@ -559,7 +559,7 @@
           <w:i/>
           <w:shd w:val="clear" w:color="auto" w:fill="FFFFFF"/>
         </w:rPr>
-        <w:t>Căn cứ Quyết định số 38/2026/QĐ-UBND ngày 29/4/2026 của Ủy ban nhân dân tỉnh Quảng Ngãi ban hành Quy chế làm việc của Ủy ban nhân dân tỉnh Quảng Ngãi, nhiệm kỳ 2021-2026.</w:t>
+        <w:t>Căn cứ Quyết định số 38/2026/QĐ-UBND ngày 29/4/2026 của Ủy ban nhân dân tỉnh Quảng Ngãi ban hành Quy chế làm việc của Ủy ban nhân dân tỉnh Quảng Ngãi, nhiệm kỳ 2026-2031.</w:t>
       </w:r>
     </w:p>
     <w:p>
@@ -4926,7 +4926,7 @@
         <w:rPr>
           <w:bCs/>
         </w:rPr>
-        <w:t>7</w:t>
+        <w:t>[…]</w:t>
       </w:r>
       <w:r>
         <w:rPr>
@@ -7765,7 +7765,6 @@
         <w:rPr>
           <w:shd w:val="clear" w:color="auto" w:fill="FFFFFF"/>
         </w:rPr>
-        <w:t xml:space="preserve">báo cáo </w:t>
       </w:r>
       <w:r>
         <w:rPr>

</xml_diff>